<commit_message>
Use Your Next Step Calendly event, refund when coach cancels
Co-Authored-By: Claude Opus 5.5 <noreply@anthropic.com>
Claude-Session: https://claude.ai/code/session_01QtsEaUnHz7gtTApzgSGYm3
</commit_message>
<xml_diff>
--- a/your-next-step/Privacy Policy and Terms systeme.io Copy.docx
+++ b/your-next-step/Privacy Policy and Terms systeme.io Copy.docx
@@ -100,7 +100,7 @@
         <w:t xml:space="preserve">Calendly: </w:t>
       </w:r>
       <w:r>
-        <w:t>in the Breakthrough event settings, add the Terms link to the booking confirmation or booking page so clients see the 24 hour and no refund policy before paying.</w:t>
+        <w:t>in the Your Next Step event settings, add the Terms link to the booking confirmation or booking page so clients see the 24 hour and no refund policy before paying.</w:t>
       </w:r>
     </w:p>
     <w:p>
@@ -620,7 +620,7 @@
         <w:pStyle w:val="ListBullet"/>
       </w:pPr>
       <w:r>
-        <w:t>All payments are final. We do not offer refunds.</w:t>
+        <w:t>All payments are final. We do not offer refunds, except when we cancel your session as described below.</w:t>
       </w:r>
     </w:p>
     <w:p>
@@ -628,7 +628,7 @@
         <w:pStyle w:val="ListBullet"/>
       </w:pPr>
       <w:r>
-        <w:t>If we need to cancel or reschedule, we will notify you at least 24 hours in advance and help you choose a new time at no additional cost.</w:t>
+        <w:t>If we need to cancel or reschedule, we will notify you at least 24 hours in advance. You may choose a new time at no additional cost or receive a full refund.</w:t>
       </w:r>
     </w:p>
     <w:p>

</xml_diff>

<commit_message>
Book through systeme.io checkout and calendar instead of Calendly
Co-Authored-By: Claude Opus 5.5 <noreply@anthropic.com>
Claude-Session: https://claude.ai/code/session_01QtsEaUnHz7gtTApzgSGYm3
</commit_message>
<xml_diff>
--- a/your-next-step/Privacy Policy and Terms systeme.io Copy.docx
+++ b/your-next-step/Privacy Policy and Terms systeme.io Copy.docx
@@ -97,10 +97,10 @@
         <w:rPr>
           <w:b/>
         </w:rPr>
-        <w:t xml:space="preserve">Calendly: </w:t>
+        <w:t xml:space="preserve">Checkout: </w:t>
       </w:r>
       <w:r>
-        <w:t>in the Your Next Step event settings, add the Terms link to the booking confirmation or booking page so clients see the 24 hour and no refund policy before paying.</w:t>
+        <w:t>on the Your Next Step checkout page, add a required checkbox that links to the Terms page so clients agree to the 24 hour and no refund policy before paying.</w:t>
       </w:r>
     </w:p>
     <w:p>
@@ -273,15 +273,7 @@
         <w:pStyle w:val="ListBullet"/>
       </w:pPr>
       <w:r>
-        <w:t>Calendly, for scheduling.</w:t>
-      </w:r>
-    </w:p>
-    <w:p>
-      <w:pPr>
-        <w:pStyle w:val="ListBullet"/>
-      </w:pPr>
-      <w:r>
-        <w:t>Zoom, for coaching sessions.</w:t>
+        <w:t>systeme.io, for our website, checkout, scheduling, and email.</w:t>
       </w:r>
     </w:p>
     <w:p>
@@ -297,7 +289,7 @@
         <w:pStyle w:val="ListBullet"/>
       </w:pPr>
       <w:r>
-        <w:t>systeme.io, for our website and email.</w:t>
+        <w:t>Zoom, for coaching sessions.</w:t>
       </w:r>
     </w:p>
     <w:p>
@@ -532,7 +524,7 @@
     </w:p>
     <w:p>
       <w:r>
-        <w:t>Your Next Step is a 60-minute, one-on-one coaching session held on Zoom. You will receive the Zoom details after you book. Please join from a private space with a reliable internet connection.</w:t>
+        <w:t>Your Next Step is a 60-minute, one-on-one coaching session held on Zoom. You will receive the Zoom details after you choose your session time. Please join from a private space with a reliable internet connection.</w:t>
       </w:r>
     </w:p>
     <w:p>
@@ -585,7 +577,7 @@
     </w:p>
     <w:p>
       <w:r>
-        <w:t>Sessions are paid in full at the time of booking through Stripe or PayPal. The price is shown on the booking page before you pay.</w:t>
+        <w:t>Sessions are paid in full at checkout through Stripe or PayPal. The price is shown at checkout before you pay. After payment, you choose your session time on our scheduling page.</w:t>
       </w:r>
     </w:p>
     <w:p>
@@ -604,7 +596,7 @@
         <w:pStyle w:val="ListBullet"/>
       </w:pPr>
       <w:r>
-        <w:t>You may reschedule your session with at least 24 hours’ notice before your scheduled start time. Use the link in your confirmation email or email us.</w:t>
+        <w:t>You may reschedule your session with at least 24 hours’ notice before your scheduled start time. To reschedule, email nechelle@iamnechellemarie.com.</w:t>
       </w:r>
     </w:p>
     <w:p>

</xml_diff>

<commit_message>
Add $125 price and separate Legal Pages funnel to build notes
Co-Authored-By: Claude Opus 5.5 <noreply@anthropic.com>
Claude-Session: https://claude.ai/code/session_01QtsEaUnHz7gtTApzgSGYm3
</commit_message>
<xml_diff>
--- a/your-next-step/Privacy Policy and Terms systeme.io Copy.docx
+++ b/your-next-step/Privacy Policy and Terms systeme.io Copy.docx
@@ -41,10 +41,10 @@
         <w:rPr>
           <w:b/>
         </w:rPr>
-        <w:t xml:space="preserve">Create two pages: </w:t>
+        <w:t xml:space="preserve">Create a separate funnel named Legal Pages </w:t>
       </w:r>
       <w:r>
-        <w:t>Privacy Policy (suggested URL /privacy-policy) and Terms (suggested URL /terms).</w:t>
+        <w:t>with two steps: Privacy Policy (path privacy-policy) and Terms (path terms). Keep them out of the Your Next Step booking funnel.</w:t>
       </w:r>
     </w:p>
     <w:p>

</xml_diff>

<commit_message>
Return booking buttons to the Calendly Your Next Step event
Co-Authored-By: Claude Opus 5.5 <noreply@anthropic.com>
Claude-Session: https://claude.ai/code/session_01QtsEaUnHz7gtTApzgSGYm3
</commit_message>
<xml_diff>
--- a/your-next-step/Privacy Policy and Terms systeme.io Copy.docx
+++ b/your-next-step/Privacy Policy and Terms systeme.io Copy.docx
@@ -97,10 +97,10 @@
         <w:rPr>
           <w:b/>
         </w:rPr>
-        <w:t xml:space="preserve">Checkout: </w:t>
+        <w:t xml:space="preserve">Calendly: </w:t>
       </w:r>
       <w:r>
-        <w:t>on the Your Next Step checkout page, add a required checkbox that links to the Terms page so clients agree to the 24 hour and no refund policy before paying.</w:t>
+        <w:t>in the Your Next Step event settings, add the Terms link to the booking page so clients see the 24 hour and no refund policy before paying.</w:t>
       </w:r>
     </w:p>
     <w:p>
@@ -273,7 +273,15 @@
         <w:pStyle w:val="ListBullet"/>
       </w:pPr>
       <w:r>
-        <w:t>systeme.io, for our website, checkout, scheduling, and email.</w:t>
+        <w:t>Calendly, for scheduling.</w:t>
+      </w:r>
+    </w:p>
+    <w:p>
+      <w:pPr>
+        <w:pStyle w:val="ListBullet"/>
+      </w:pPr>
+      <w:r>
+        <w:t>Zoom, for coaching sessions.</w:t>
       </w:r>
     </w:p>
     <w:p>
@@ -289,7 +297,7 @@
         <w:pStyle w:val="ListBullet"/>
       </w:pPr>
       <w:r>
-        <w:t>Zoom, for coaching sessions.</w:t>
+        <w:t>systeme.io, for our website and email.</w:t>
       </w:r>
     </w:p>
     <w:p>
@@ -524,7 +532,7 @@
     </w:p>
     <w:p>
       <w:r>
-        <w:t>Your Next Step is a 60-minute, one-on-one coaching session held on Zoom. You will receive the Zoom details after you choose your session time. Please join from a private space with a reliable internet connection.</w:t>
+        <w:t>Your Next Step is a 60-minute, one-on-one coaching session held on Zoom. You will receive the Zoom details after you book. Please join from a private space with a reliable internet connection.</w:t>
       </w:r>
     </w:p>
     <w:p>
@@ -577,7 +585,7 @@
     </w:p>
     <w:p>
       <w:r>
-        <w:t>Sessions are paid in full at checkout through Stripe or PayPal. The price is shown at checkout before you pay. After payment, you choose your session time on our scheduling page.</w:t>
+        <w:t>Sessions are paid in full at the time of booking through Stripe or PayPal. The price is shown on the booking page before you pay.</w:t>
       </w:r>
     </w:p>
     <w:p>
@@ -596,7 +604,7 @@
         <w:pStyle w:val="ListBullet"/>
       </w:pPr>
       <w:r>
-        <w:t>You may reschedule your session with at least 24 hours’ notice before your scheduled start time. To reschedule, email nechelle@iamnechellemarie.com.</w:t>
+        <w:t>You may reschedule your session with at least 24 hours’ notice before your scheduled start time. Use the link in your confirmation email or email us.</w:t>
       </w:r>
     </w:p>
     <w:p>

</xml_diff>

<commit_message>
Add website systeme.io paste blocks, footer brand fix, guide signup in privacy policy
Co-Authored-By: Claude Opus 5.5 <noreply@anthropic.com>
Claude-Session: https://claude.ai/code/session_01QtsEaUnHz7gtTApzgSGYm3
</commit_message>
<xml_diff>
--- a/your-next-step/Privacy Policy and Terms systeme.io Copy.docx
+++ b/your-next-step/Privacy Policy and Terms systeme.io Copy.docx
@@ -125,7 +125,7 @@
           <w:i/>
           <w:color w:val="5D4D58"/>
         </w:rPr>
-        <w:t>Effective October 14, 2026</w:t>
+        <w:t>Effective October 15, 2026</w:t>
       </w:r>
     </w:p>
     <w:p>
@@ -147,6 +147,14 @@
     <w:p>
       <w:r>
         <w:t>Information you give us:</w:t>
+      </w:r>
+    </w:p>
+    <w:p>
+      <w:pPr>
+        <w:pStyle w:val="ListBullet"/>
+      </w:pPr>
+      <w:r>
+        <w:t>Your first name and email address when you request our free guide.</w:t>
       </w:r>
     </w:p>
     <w:p>
@@ -199,6 +207,14 @@
         <w:pStyle w:val="ListBullet"/>
       </w:pPr>
       <w:r>
+        <w:t>To send the free guide you requested and a short series of follow up emails. Every email includes a link to unsubscribe.</w:t>
+      </w:r>
+    </w:p>
+    <w:p>
+      <w:pPr>
+        <w:pStyle w:val="ListBullet"/>
+      </w:pPr>
+      <w:r>
         <w:t>To schedule and deliver your coaching session, including sending confirmations, reminders, and Zoom details.</w:t>
       </w:r>
     </w:p>
@@ -228,7 +244,7 @@
     </w:p>
     <w:p>
       <w:r>
-        <w:t>We do not sell your personal information. We do not add you to our email list when you book. You join our email list only if you ask to.</w:t>
+        <w:t>We do not sell your personal information. We do not add you to our email list when you book a session. You join our email list only when you request our free guide or ask to join, and you can unsubscribe at any time.</w:t>
       </w:r>
     </w:p>
     <w:p>
@@ -495,7 +511,7 @@
           <w:i/>
           <w:color w:val="5D4D58"/>
         </w:rPr>
-        <w:t>Effective October 14, 2026</w:t>
+        <w:t>Effective October 15, 2026</w:t>
       </w:r>
     </w:p>
     <w:p>

</xml_diff>